<commit_message>
Added .Htaccess and Spicker
</commit_message>
<xml_diff>
--- a/Teil_1/M293_Spicker_Teil1.docx
+++ b/Teil_1/M293_Spicker_Teil1.docx
@@ -2,7 +2,1394 @@
 <file path=word/document.xml><?xml version="1.0" encoding="utf-8"?>
 <w:document xmlns:wpc="http://schemas.microsoft.com/office/word/2010/wordprocessingCanvas" xmlns:cx="http://schemas.microsoft.com/office/drawing/2014/chartex" xmlns:cx1="http://schemas.microsoft.com/office/drawing/2015/9/8/chartex" xmlns:cx2="http://schemas.microsoft.com/office/drawing/2015/10/21/chartex" xmlns:cx3="http://schemas.microsoft.com/office/drawing/2016/5/9/chartex" xmlns:cx4="http://schemas.microsoft.com/office/drawing/2016/5/10/chartex" xmlns:cx5="http://schemas.microsoft.com/office/drawing/2016/5/11/chartex" xmlns:cx6="http://schemas.microsoft.com/office/drawing/2016/5/12/chartex" xmlns:cx7="http://schemas.microsoft.com/office/drawing/2016/5/13/chartex" xmlns:cx8="http://schemas.microsoft.com/office/drawing/2016/5/14/chartex" xmlns:mc="http://schemas.openxmlformats.org/markup-compatibility/2006" xmlns:aink="http://schemas.microsoft.com/office/drawing/2016/ink" xmlns:am3d="http://schemas.microsoft.com/office/drawing/2017/model3d" xmlns:o="urn:schemas-microsoft-com:office:office" xmlns:oel="http://schemas.microsoft.com/office/2019/extlst" xmlns:r="http://schemas.openxmlformats.org/officeDocument/2006/relationships" xmlns:m="http://schemas.openxmlformats.org/officeDocument/2006/math" xmlns:v="urn:schemas-microsoft-com:vml" xmlns:wp14="http://schemas.microsoft.com/office/word/2010/wordprocessingDrawing" xmlns:wp="http://schemas.openxmlformats.org/drawingml/2006/wordprocessingDrawing" xmlns:w10="urn:schemas-microsoft-com:office:word" xmlns:w="http://schemas.openxmlformats.org/wordprocessingml/2006/main" xmlns:w14="http://schemas.microsoft.com/office/word/2010/wordml" xmlns:w15="http://schemas.microsoft.com/office/word/2012/wordml" xmlns:w16cex="http://schemas.microsoft.com/office/word/2018/wordml/cex" xmlns:w16cid="http://schemas.microsoft.com/office/word/2016/wordml/cid" xmlns:w16="http://schemas.microsoft.com/office/word/2018/wordml" xmlns:w16du="http://schemas.microsoft.com/office/word/2023/wordml/word16du" xmlns:w16sdtdh="http://schemas.microsoft.com/office/word/2020/wordml/sdtdatahash" xmlns:w16sdtfl="http://schemas.microsoft.com/office/word/2024/wordml/sdtformatlock" xmlns:w16se="http://schemas.microsoft.com/office/word/2015/wordml/symex" xmlns:wpg="http://schemas.microsoft.com/office/word/2010/wordprocessingGroup" xmlns:wpi="http://schemas.microsoft.com/office/word/2010/wordprocessingInk" xmlns:wne="http://schemas.microsoft.com/office/word/2006/wordml" xmlns:wps="http://schemas.microsoft.com/office/word/2010/wordprocessingShape" mc:Ignorable="w14 w15 w16se w16cid w16 w16cex w16sdtdh w16sdtfl w16du wp14">
   <w:body>
-    <w:p/>
+    <w:p>
+      <w:pPr>
+        <w:rPr>
+          <w:lang w:val="en-US"/>
+        </w:rPr>
+      </w:pPr>
+      <w:r>
+        <w:rPr>
+          <w:noProof/>
+        </w:rPr>
+        <w:drawing>
+          <wp:anchor distT="0" distB="0" distL="114300" distR="114300" simplePos="0" relativeHeight="251658240" behindDoc="1" locked="0" layoutInCell="1" allowOverlap="1" wp14:anchorId="334F1EC5" wp14:editId="0FC57EFA">
+            <wp:simplePos x="0" y="0"/>
+            <wp:positionH relativeFrom="margin">
+              <wp:posOffset>-740780</wp:posOffset>
+            </wp:positionH>
+            <wp:positionV relativeFrom="paragraph">
+              <wp:posOffset>88</wp:posOffset>
+            </wp:positionV>
+            <wp:extent cx="4006215" cy="1076325"/>
+            <wp:effectExtent l="0" t="0" r="0" b="9525"/>
+            <wp:wrapTight wrapText="bothSides">
+              <wp:wrapPolygon edited="0">
+                <wp:start x="0" y="0"/>
+                <wp:lineTo x="0" y="21409"/>
+                <wp:lineTo x="21466" y="21409"/>
+                <wp:lineTo x="21466" y="0"/>
+                <wp:lineTo x="0" y="0"/>
+              </wp:wrapPolygon>
+            </wp:wrapTight>
+            <wp:docPr id="377545619" name="Grafik 1"/>
+            <wp:cNvGraphicFramePr>
+              <a:graphicFrameLocks xmlns:a="http://schemas.openxmlformats.org/drawingml/2006/main" noChangeAspect="1"/>
+            </wp:cNvGraphicFramePr>
+            <a:graphic xmlns:a="http://schemas.openxmlformats.org/drawingml/2006/main">
+              <a:graphicData uri="http://schemas.openxmlformats.org/drawingml/2006/picture">
+                <pic:pic xmlns:pic="http://schemas.openxmlformats.org/drawingml/2006/picture">
+                  <pic:nvPicPr>
+                    <pic:cNvPr id="0" name="Picture 1"/>
+                    <pic:cNvPicPr>
+                      <a:picLocks noChangeAspect="1" noChangeArrowheads="1"/>
+                    </pic:cNvPicPr>
+                  </pic:nvPicPr>
+                  <pic:blipFill>
+                    <a:blip r:embed="rId5">
+                      <a:extLst>
+                        <a:ext uri="{28A0092B-C50C-407E-A947-70E740481C1C}">
+                          <a14:useLocalDpi xmlns:a14="http://schemas.microsoft.com/office/drawing/2010/main" val="0"/>
+                        </a:ext>
+                      </a:extLst>
+                    </a:blip>
+                    <a:srcRect/>
+                    <a:stretch>
+                      <a:fillRect/>
+                    </a:stretch>
+                  </pic:blipFill>
+                  <pic:spPr bwMode="auto">
+                    <a:xfrm>
+                      <a:off x="0" y="0"/>
+                      <a:ext cx="4006215" cy="1076325"/>
+                    </a:xfrm>
+                    <a:prstGeom prst="rect">
+                      <a:avLst/>
+                    </a:prstGeom>
+                    <a:noFill/>
+                    <a:ln>
+                      <a:noFill/>
+                    </a:ln>
+                  </pic:spPr>
+                </pic:pic>
+              </a:graphicData>
+            </a:graphic>
+            <wp14:sizeRelH relativeFrom="margin">
+              <wp14:pctWidth>0</wp14:pctWidth>
+            </wp14:sizeRelH>
+            <wp14:sizeRelV relativeFrom="margin">
+              <wp14:pctHeight>0</wp14:pctHeight>
+            </wp14:sizeRelV>
+          </wp:anchor>
+        </w:drawing>
+      </w:r>
+      <w:r>
+        <w:rPr>
+          <w:lang w:val="en-US"/>
+        </w:rPr>
+        <w:t>HTTP:</w:t>
+      </w:r>
+      <w:r>
+        <w:rPr>
+          <w:lang w:val="en-US"/>
+        </w:rPr>
+        <w:t xml:space="preserve"> </w:t>
+      </w:r>
+      <w:r>
+        <w:rPr>
+          <w:lang w:val="en-US"/>
+        </w:rPr>
+        <w:t>Hypertext</w:t>
+      </w:r>
+      <w:r>
+        <w:rPr>
+          <w:lang w:val="en-US"/>
+        </w:rPr>
+        <w:t xml:space="preserve"> </w:t>
+      </w:r>
+      <w:r>
+        <w:rPr>
+          <w:lang w:val="en-US"/>
+        </w:rPr>
+        <w:t>Transfer</w:t>
+      </w:r>
+      <w:r>
+        <w:rPr>
+          <w:lang w:val="en-US"/>
+        </w:rPr>
+        <w:t xml:space="preserve"> </w:t>
+      </w:r>
+      <w:r>
+        <w:rPr>
+          <w:lang w:val="en-US"/>
+        </w:rPr>
+        <w:t>Protocols</w:t>
+      </w:r>
+    </w:p>
+    <w:p>
+      <w:pPr>
+        <w:rPr>
+          <w:lang w:val="en-US"/>
+        </w:rPr>
+      </w:pPr>
+      <w:r>
+        <w:rPr>
+          <w:lang w:val="en-US"/>
+        </w:rPr>
+        <w:t>200</w:t>
+      </w:r>
+      <w:r>
+        <w:rPr>
+          <w:lang w:val="en-US"/>
+        </w:rPr>
+        <w:t xml:space="preserve"> </w:t>
+      </w:r>
+      <w:r>
+        <w:sym w:font="Wingdings" w:char="F0E0"/>
+      </w:r>
+      <w:r>
+        <w:rPr>
+          <w:lang w:val="en-US"/>
+        </w:rPr>
+        <w:t xml:space="preserve"> </w:t>
+      </w:r>
+      <w:r>
+        <w:rPr>
+          <w:lang w:val="en-US"/>
+        </w:rPr>
+        <w:t>OK</w:t>
+      </w:r>
+    </w:p>
+    <w:p>
+      <w:pPr>
+        <w:rPr>
+          <w:lang w:val="en-US"/>
+        </w:rPr>
+      </w:pPr>
+      <w:r>
+        <w:rPr>
+          <w:lang w:val="en-US"/>
+        </w:rPr>
+        <w:t>404</w:t>
+      </w:r>
+      <w:r>
+        <w:rPr>
+          <w:lang w:val="en-US"/>
+        </w:rPr>
+        <w:t xml:space="preserve"> </w:t>
+      </w:r>
+      <w:r>
+        <w:sym w:font="Wingdings" w:char="F0E0"/>
+      </w:r>
+      <w:r>
+        <w:rPr>
+          <w:lang w:val="en-US"/>
+        </w:rPr>
+        <w:t xml:space="preserve"> </w:t>
+      </w:r>
+      <w:r>
+        <w:rPr>
+          <w:lang w:val="en-US"/>
+        </w:rPr>
+        <w:t>Not</w:t>
+      </w:r>
+      <w:r>
+        <w:rPr>
+          <w:lang w:val="en-US"/>
+        </w:rPr>
+        <w:t xml:space="preserve"> </w:t>
+      </w:r>
+      <w:r>
+        <w:rPr>
+          <w:lang w:val="en-US"/>
+        </w:rPr>
+        <w:t>found</w:t>
+      </w:r>
+    </w:p>
+    <w:p>
+      <w:pPr>
+        <w:jc w:val="both"/>
+      </w:pPr>
+      <w:r>
+        <w:drawing>
+          <wp:anchor distT="0" distB="0" distL="114300" distR="114300" simplePos="0" relativeHeight="251659264" behindDoc="1" locked="0" layoutInCell="1" allowOverlap="1" wp14:anchorId="36727439" wp14:editId="5DF5342F">
+            <wp:simplePos x="0" y="0"/>
+            <wp:positionH relativeFrom="margin">
+              <wp:posOffset>-677119</wp:posOffset>
+            </wp:positionH>
+            <wp:positionV relativeFrom="paragraph">
+              <wp:posOffset>231960</wp:posOffset>
+            </wp:positionV>
+            <wp:extent cx="2225675" cy="1706880"/>
+            <wp:effectExtent l="0" t="0" r="3175" b="7620"/>
+            <wp:wrapTight wrapText="bothSides">
+              <wp:wrapPolygon edited="0">
+                <wp:start x="0" y="0"/>
+                <wp:lineTo x="0" y="21455"/>
+                <wp:lineTo x="21446" y="21455"/>
+                <wp:lineTo x="21446" y="0"/>
+                <wp:lineTo x="0" y="0"/>
+              </wp:wrapPolygon>
+            </wp:wrapTight>
+            <wp:docPr id="197572968" name="Grafik 1"/>
+            <wp:cNvGraphicFramePr>
+              <a:graphicFrameLocks xmlns:a="http://schemas.openxmlformats.org/drawingml/2006/main" noChangeAspect="1"/>
+            </wp:cNvGraphicFramePr>
+            <a:graphic xmlns:a="http://schemas.openxmlformats.org/drawingml/2006/main">
+              <a:graphicData uri="http://schemas.openxmlformats.org/drawingml/2006/picture">
+                <pic:pic xmlns:pic="http://schemas.openxmlformats.org/drawingml/2006/picture">
+                  <pic:nvPicPr>
+                    <pic:cNvPr id="197572968" name=""/>
+                    <pic:cNvPicPr/>
+                  </pic:nvPicPr>
+                  <pic:blipFill>
+                    <a:blip r:embed="rId6">
+                      <a:extLst>
+                        <a:ext uri="{28A0092B-C50C-407E-A947-70E740481C1C}">
+                          <a14:useLocalDpi xmlns:a14="http://schemas.microsoft.com/office/drawing/2010/main" val="0"/>
+                        </a:ext>
+                      </a:extLst>
+                    </a:blip>
+                    <a:stretch>
+                      <a:fillRect/>
+                    </a:stretch>
+                  </pic:blipFill>
+                  <pic:spPr>
+                    <a:xfrm>
+                      <a:off x="0" y="0"/>
+                      <a:ext cx="2225675" cy="1706880"/>
+                    </a:xfrm>
+                    <a:prstGeom prst="rect">
+                      <a:avLst/>
+                    </a:prstGeom>
+                  </pic:spPr>
+                </pic:pic>
+              </a:graphicData>
+            </a:graphic>
+            <wp14:sizeRelH relativeFrom="margin">
+              <wp14:pctWidth>0</wp14:pctWidth>
+            </wp14:sizeRelH>
+            <wp14:sizeRelV relativeFrom="margin">
+              <wp14:pctHeight>0</wp14:pctHeight>
+            </wp14:sizeRelV>
+          </wp:anchor>
+        </w:drawing>
+      </w:r>
+      <w:r>
+        <w:t>500</w:t>
+      </w:r>
+      <w:r>
+        <w:t xml:space="preserve"> </w:t>
+      </w:r>
+      <w:r>
+        <w:sym w:font="Wingdings" w:char="F0E0"/>
+      </w:r>
+      <w:r>
+        <w:t xml:space="preserve"> </w:t>
+      </w:r>
+      <w:r>
+        <w:t>Internal</w:t>
+      </w:r>
+      <w:r>
+        <w:t xml:space="preserve"> </w:t>
+      </w:r>
+      <w:r>
+        <w:t>Server</w:t>
+      </w:r>
+      <w:r>
+        <w:t xml:space="preserve"> </w:t>
+      </w:r>
+      <w:r>
+        <w:t>Error:</w:t>
+      </w:r>
+    </w:p>
+    <w:p>
+      <w:pPr>
+        <w:jc w:val="both"/>
+      </w:pPr>
+      <w:r>
+        <w:t>HTML:</w:t>
+      </w:r>
+      <w:r>
+        <w:t xml:space="preserve"> </w:t>
+      </w:r>
+      <w:proofErr w:type="spellStart"/>
+      <w:r>
+        <w:t>HyperText</w:t>
+      </w:r>
+      <w:proofErr w:type="spellEnd"/>
+      <w:r>
+        <w:t xml:space="preserve"> </w:t>
+      </w:r>
+      <w:r>
+        <w:t>Markup</w:t>
+      </w:r>
+      <w:r>
+        <w:t xml:space="preserve"> </w:t>
+      </w:r>
+      <w:r>
+        <w:t>Language</w:t>
+      </w:r>
+      <w:r>
+        <w:t xml:space="preserve"> </w:t>
+      </w:r>
+    </w:p>
+    <w:p>
+      <w:pPr>
+        <w:numPr>
+          <w:ilvl w:val="0"/>
+          <w:numId w:val="2"/>
+        </w:numPr>
+        <w:jc w:val="both"/>
+      </w:pPr>
+      <w:r>
+        <w:rPr>
+          <w:b/>
+        </w:rPr>
+        <w:t>&lt;</w:t>
+      </w:r>
+      <w:proofErr w:type="spellStart"/>
+      <w:r>
+        <w:rPr>
+          <w:b/>
+        </w:rPr>
+        <w:t>header</w:t>
+      </w:r>
+      <w:proofErr w:type="spellEnd"/>
+      <w:r>
+        <w:rPr>
+          <w:b/>
+        </w:rPr>
+        <w:t>&gt;–</w:t>
+      </w:r>
+      <w:r>
+        <w:t xml:space="preserve"> </w:t>
+      </w:r>
+      <w:r>
+        <w:t>Stellt</w:t>
+      </w:r>
+      <w:r>
+        <w:t xml:space="preserve"> </w:t>
+      </w:r>
+      <w:r>
+        <w:t>einen</w:t>
+      </w:r>
+      <w:r>
+        <w:t xml:space="preserve"> </w:t>
+      </w:r>
+      <w:r>
+        <w:t>Container</w:t>
+      </w:r>
+      <w:r>
+        <w:t xml:space="preserve"> </w:t>
+      </w:r>
+      <w:r>
+        <w:t>für</w:t>
+      </w:r>
+      <w:r>
+        <w:t xml:space="preserve"> </w:t>
+      </w:r>
+      <w:r>
+        <w:t>einleitende</w:t>
+      </w:r>
+      <w:r>
+        <w:t xml:space="preserve"> </w:t>
+      </w:r>
+      <w:r>
+        <w:t>Inhalte</w:t>
+      </w:r>
+      <w:r>
+        <w:t xml:space="preserve"> </w:t>
+      </w:r>
+      <w:r>
+        <w:t>und</w:t>
+      </w:r>
+      <w:r>
+        <w:t xml:space="preserve"> </w:t>
+      </w:r>
+      <w:r>
+        <w:t>Navigationslinks</w:t>
+      </w:r>
+      <w:r>
+        <w:t xml:space="preserve"> </w:t>
+      </w:r>
+      <w:r>
+        <w:t>dar</w:t>
+      </w:r>
+    </w:p>
+    <w:p>
+      <w:pPr>
+        <w:numPr>
+          <w:ilvl w:val="0"/>
+          <w:numId w:val="2"/>
+        </w:numPr>
+        <w:jc w:val="both"/>
+      </w:pPr>
+      <w:r>
+        <w:rPr>
+          <w:b/>
+        </w:rPr>
+        <w:t>&lt;</w:t>
+      </w:r>
+      <w:proofErr w:type="spellStart"/>
+      <w:r>
+        <w:rPr>
+          <w:b/>
+        </w:rPr>
+        <w:t>nav</w:t>
+      </w:r>
+      <w:proofErr w:type="spellEnd"/>
+      <w:r>
+        <w:rPr>
+          <w:b/>
+        </w:rPr>
+        <w:t>&gt;–</w:t>
+      </w:r>
+      <w:r>
+        <w:t xml:space="preserve"> </w:t>
+      </w:r>
+      <w:r>
+        <w:t>Definiert</w:t>
+      </w:r>
+      <w:r>
+        <w:t xml:space="preserve"> </w:t>
+      </w:r>
+      <w:r>
+        <w:t>eine</w:t>
+      </w:r>
+      <w:r>
+        <w:t xml:space="preserve"> </w:t>
+      </w:r>
+      <w:r>
+        <w:t>Reihe</w:t>
+      </w:r>
+      <w:r>
+        <w:t xml:space="preserve"> </w:t>
+      </w:r>
+      <w:r>
+        <w:t>von</w:t>
+      </w:r>
+      <w:r>
+        <w:t xml:space="preserve"> </w:t>
+      </w:r>
+      <w:r>
+        <w:t>Navigationslinks</w:t>
+      </w:r>
+    </w:p>
+    <w:p>
+      <w:pPr>
+        <w:numPr>
+          <w:ilvl w:val="0"/>
+          <w:numId w:val="2"/>
+        </w:numPr>
+        <w:jc w:val="both"/>
+      </w:pPr>
+      <w:r>
+        <w:rPr>
+          <w:b/>
+        </w:rPr>
+        <w:t>&lt;</w:t>
+      </w:r>
+      <w:proofErr w:type="spellStart"/>
+      <w:r>
+        <w:rPr>
+          <w:b/>
+        </w:rPr>
+        <w:t>section</w:t>
+      </w:r>
+      <w:proofErr w:type="spellEnd"/>
+      <w:r>
+        <w:rPr>
+          <w:b/>
+        </w:rPr>
+        <w:t>&gt;</w:t>
+      </w:r>
+      <w:r>
+        <w:t xml:space="preserve"> </w:t>
+      </w:r>
+      <w:r>
+        <w:t>–</w:t>
+      </w:r>
+      <w:r>
+        <w:t xml:space="preserve"> </w:t>
+      </w:r>
+      <w:r>
+        <w:t>Definiert</w:t>
+      </w:r>
+      <w:r>
+        <w:t xml:space="preserve"> </w:t>
+      </w:r>
+      <w:r>
+        <w:t>einen</w:t>
+      </w:r>
+      <w:r>
+        <w:t xml:space="preserve"> </w:t>
+      </w:r>
+      <w:r>
+        <w:t>Abschnitt</w:t>
+      </w:r>
+      <w:r>
+        <w:t xml:space="preserve"> </w:t>
+      </w:r>
+      <w:r>
+        <w:t>in</w:t>
+      </w:r>
+      <w:r>
+        <w:t xml:space="preserve"> </w:t>
+      </w:r>
+      <w:r>
+        <w:t>einem</w:t>
+      </w:r>
+      <w:r>
+        <w:t xml:space="preserve"> </w:t>
+      </w:r>
+      <w:r>
+        <w:t>Dokument</w:t>
+      </w:r>
+    </w:p>
+    <w:p>
+      <w:pPr>
+        <w:numPr>
+          <w:ilvl w:val="0"/>
+          <w:numId w:val="2"/>
+        </w:numPr>
+        <w:jc w:val="both"/>
+      </w:pPr>
+      <w:r>
+        <w:rPr>
+          <w:b/>
+        </w:rPr>
+        <w:t>&lt;</w:t>
+      </w:r>
+      <w:proofErr w:type="spellStart"/>
+      <w:r>
+        <w:rPr>
+          <w:b/>
+        </w:rPr>
+        <w:t>article</w:t>
+      </w:r>
+      <w:proofErr w:type="spellEnd"/>
+      <w:r>
+        <w:rPr>
+          <w:b/>
+        </w:rPr>
+        <w:t>&gt;</w:t>
+      </w:r>
+      <w:r>
+        <w:t xml:space="preserve"> </w:t>
+      </w:r>
+      <w:r>
+        <w:t>–</w:t>
+      </w:r>
+      <w:r>
+        <w:t xml:space="preserve"> </w:t>
+      </w:r>
+      <w:r>
+        <w:t>Definiert</w:t>
+      </w:r>
+      <w:r>
+        <w:t xml:space="preserve"> </w:t>
+      </w:r>
+      <w:r>
+        <w:t>einen</w:t>
+      </w:r>
+      <w:r>
+        <w:t xml:space="preserve"> </w:t>
+      </w:r>
+      <w:r>
+        <w:t>unabhängigen,</w:t>
+      </w:r>
+      <w:r>
+        <w:t xml:space="preserve"> </w:t>
+      </w:r>
+      <w:r>
+        <w:t>in</w:t>
+      </w:r>
+      <w:r>
+        <w:t xml:space="preserve"> </w:t>
+      </w:r>
+      <w:r>
+        <w:t>sich</w:t>
+      </w:r>
+      <w:r>
+        <w:t xml:space="preserve"> </w:t>
+      </w:r>
+      <w:r>
+        <w:t>abgeschlossenen</w:t>
+      </w:r>
+      <w:r>
+        <w:t xml:space="preserve"> </w:t>
+      </w:r>
+      <w:r>
+        <w:t>Inhalt</w:t>
+      </w:r>
+    </w:p>
+    <w:p>
+      <w:pPr>
+        <w:numPr>
+          <w:ilvl w:val="0"/>
+          <w:numId w:val="2"/>
+        </w:numPr>
+        <w:jc w:val="both"/>
+      </w:pPr>
+      <w:r>
+        <w:rPr>
+          <w:b/>
+        </w:rPr>
+        <w:t>&lt;</w:t>
+      </w:r>
+      <w:proofErr w:type="spellStart"/>
+      <w:r>
+        <w:rPr>
+          <w:b/>
+        </w:rPr>
+        <w:t>aside</w:t>
+      </w:r>
+      <w:proofErr w:type="spellEnd"/>
+      <w:r>
+        <w:rPr>
+          <w:b/>
+        </w:rPr>
+        <w:t>&gt;</w:t>
+      </w:r>
+      <w:r>
+        <w:t xml:space="preserve"> </w:t>
+      </w:r>
+      <w:r>
+        <w:t>–</w:t>
+      </w:r>
+      <w:r>
+        <w:t xml:space="preserve"> </w:t>
+      </w:r>
+      <w:r>
+        <w:t>Definiert</w:t>
+      </w:r>
+      <w:r>
+        <w:t xml:space="preserve"> </w:t>
+      </w:r>
+      <w:r>
+        <w:t>Inhalt</w:t>
+      </w:r>
+      <w:r>
+        <w:t xml:space="preserve"> </w:t>
+      </w:r>
+      <w:r>
+        <w:t>neben</w:t>
+      </w:r>
+      <w:r>
+        <w:t xml:space="preserve"> </w:t>
+      </w:r>
+      <w:r>
+        <w:t>dem</w:t>
+      </w:r>
+      <w:r>
+        <w:t xml:space="preserve"> </w:t>
+      </w:r>
+      <w:r>
+        <w:t>Inhalt</w:t>
+      </w:r>
+      <w:r>
+        <w:t xml:space="preserve"> </w:t>
+      </w:r>
+      <w:r>
+        <w:t>(wie</w:t>
+      </w:r>
+      <w:r>
+        <w:t xml:space="preserve"> </w:t>
+      </w:r>
+      <w:r>
+        <w:t>eine</w:t>
+      </w:r>
+      <w:r>
+        <w:t xml:space="preserve"> </w:t>
+      </w:r>
+      <w:r>
+        <w:t>Seitenleiste)</w:t>
+      </w:r>
+    </w:p>
+    <w:p>
+      <w:pPr>
+        <w:numPr>
+          <w:ilvl w:val="0"/>
+          <w:numId w:val="2"/>
+        </w:numPr>
+        <w:jc w:val="both"/>
+      </w:pPr>
+      <w:r>
+        <w:rPr>
+          <w:b/>
+        </w:rPr>
+        <w:t>&lt;</w:t>
+      </w:r>
+      <w:proofErr w:type="spellStart"/>
+      <w:r>
+        <w:rPr>
+          <w:b/>
+        </w:rPr>
+        <w:t>footer</w:t>
+      </w:r>
+      <w:proofErr w:type="spellEnd"/>
+      <w:r>
+        <w:rPr>
+          <w:b/>
+        </w:rPr>
+        <w:t>&gt;</w:t>
+      </w:r>
+      <w:r>
+        <w:t xml:space="preserve"> </w:t>
+      </w:r>
+      <w:r>
+        <w:t>–</w:t>
+      </w:r>
+      <w:r>
+        <w:t xml:space="preserve"> </w:t>
+      </w:r>
+      <w:r>
+        <w:t>Definiert</w:t>
+      </w:r>
+      <w:r>
+        <w:t xml:space="preserve"> </w:t>
+      </w:r>
+      <w:r>
+        <w:t>eine</w:t>
+      </w:r>
+      <w:r>
+        <w:t xml:space="preserve"> </w:t>
+      </w:r>
+      <w:r>
+        <w:t>Fusszeile</w:t>
+      </w:r>
+      <w:r>
+        <w:t xml:space="preserve"> </w:t>
+      </w:r>
+      <w:r>
+        <w:t>für</w:t>
+      </w:r>
+      <w:r>
+        <w:t xml:space="preserve"> </w:t>
+      </w:r>
+      <w:r>
+        <w:t>ein</w:t>
+      </w:r>
+      <w:r>
+        <w:t xml:space="preserve"> </w:t>
+      </w:r>
+      <w:r>
+        <w:t>Dokument</w:t>
+      </w:r>
+      <w:r>
+        <w:t xml:space="preserve"> </w:t>
+      </w:r>
+      <w:r>
+        <w:t>oder</w:t>
+      </w:r>
+      <w:r>
+        <w:t xml:space="preserve"> </w:t>
+      </w:r>
+      <w:r>
+        <w:t>einen</w:t>
+      </w:r>
+      <w:r>
+        <w:t xml:space="preserve"> </w:t>
+      </w:r>
+      <w:r>
+        <w:t>Abschnitt</w:t>
+      </w:r>
+    </w:p>
+    <w:p>
+      <w:pPr>
+        <w:numPr>
+          <w:ilvl w:val="0"/>
+          <w:numId w:val="2"/>
+        </w:numPr>
+        <w:jc w:val="both"/>
+      </w:pPr>
+      <w:r>
+        <w:rPr>
+          <w:b/>
+        </w:rPr>
+        <w:t>&lt;</w:t>
+      </w:r>
+      <w:proofErr w:type="spellStart"/>
+      <w:r>
+        <w:rPr>
+          <w:b/>
+        </w:rPr>
+        <w:t>details</w:t>
+      </w:r>
+      <w:proofErr w:type="spellEnd"/>
+      <w:r>
+        <w:rPr>
+          <w:b/>
+        </w:rPr>
+        <w:t>&gt;</w:t>
+      </w:r>
+      <w:r>
+        <w:t xml:space="preserve"> </w:t>
+      </w:r>
+      <w:r>
+        <w:t>–</w:t>
+      </w:r>
+      <w:r>
+        <w:t xml:space="preserve"> </w:t>
+      </w:r>
+      <w:r>
+        <w:t>Definiert</w:t>
+      </w:r>
+      <w:r>
+        <w:t xml:space="preserve"> </w:t>
+      </w:r>
+      <w:r>
+        <w:t>zusätzliche</w:t>
+      </w:r>
+      <w:r>
+        <w:t xml:space="preserve"> </w:t>
+      </w:r>
+      <w:r>
+        <w:t>Details,</w:t>
+      </w:r>
+      <w:r>
+        <w:t xml:space="preserve"> </w:t>
+      </w:r>
+      <w:r>
+        <w:t>die</w:t>
+      </w:r>
+      <w:r>
+        <w:t xml:space="preserve"> </w:t>
+      </w:r>
+      <w:r>
+        <w:t>der</w:t>
+      </w:r>
+      <w:r>
+        <w:t xml:space="preserve"> </w:t>
+      </w:r>
+      <w:r>
+        <w:t>Benutzer</w:t>
+      </w:r>
+      <w:r>
+        <w:t xml:space="preserve"> </w:t>
+      </w:r>
+      <w:r>
+        <w:t>bei</w:t>
+      </w:r>
+      <w:r>
+        <w:t xml:space="preserve"> </w:t>
+      </w:r>
+      <w:r>
+        <w:t>Bedarf</w:t>
+      </w:r>
+      <w:r>
+        <w:t xml:space="preserve"> </w:t>
+      </w:r>
+      <w:r>
+        <w:t>öffnen</w:t>
+      </w:r>
+      <w:r>
+        <w:t xml:space="preserve"> </w:t>
+      </w:r>
+      <w:r>
+        <w:t>und</w:t>
+      </w:r>
+      <w:r>
+        <w:t xml:space="preserve"> </w:t>
+      </w:r>
+      <w:r>
+        <w:t>schliessen</w:t>
+      </w:r>
+      <w:r>
+        <w:t xml:space="preserve"> </w:t>
+      </w:r>
+      <w:r>
+        <w:t>kann</w:t>
+      </w:r>
+    </w:p>
+    <w:p>
+      <w:pPr>
+        <w:numPr>
+          <w:ilvl w:val="0"/>
+          <w:numId w:val="2"/>
+        </w:numPr>
+        <w:jc w:val="both"/>
+      </w:pPr>
+      <w:r>
+        <w:rPr>
+          <w:b/>
+        </w:rPr>
+        <w:t>&lt;</w:t>
+      </w:r>
+      <w:proofErr w:type="spellStart"/>
+      <w:r>
+        <w:rPr>
+          <w:b/>
+        </w:rPr>
+        <w:t>summary</w:t>
+      </w:r>
+      <w:proofErr w:type="spellEnd"/>
+      <w:r>
+        <w:rPr>
+          <w:b/>
+        </w:rPr>
+        <w:t>&gt;-</w:t>
+      </w:r>
+      <w:r>
+        <w:t xml:space="preserve"> </w:t>
+      </w:r>
+      <w:r>
+        <w:t>Definiert</w:t>
+      </w:r>
+      <w:r>
+        <w:t xml:space="preserve"> </w:t>
+      </w:r>
+      <w:r>
+        <w:t>eine</w:t>
+      </w:r>
+      <w:r>
+        <w:t xml:space="preserve"> </w:t>
+      </w:r>
+      <w:r>
+        <w:t>Überschrift</w:t>
+      </w:r>
+      <w:r>
+        <w:t xml:space="preserve"> </w:t>
+      </w:r>
+      <w:r>
+        <w:t>für</w:t>
+      </w:r>
+      <w:r>
+        <w:t xml:space="preserve"> </w:t>
+      </w:r>
+      <w:r>
+        <w:t>das</w:t>
+      </w:r>
+      <w:r>
+        <w:t xml:space="preserve"> </w:t>
+      </w:r>
+      <w:r>
+        <w:rPr>
+          <w:b/>
+        </w:rPr>
+        <w:t>&lt;</w:t>
+      </w:r>
+      <w:proofErr w:type="spellStart"/>
+      <w:r>
+        <w:rPr>
+          <w:b/>
+        </w:rPr>
+        <w:t>details</w:t>
+      </w:r>
+      <w:proofErr w:type="spellEnd"/>
+      <w:r>
+        <w:rPr>
+          <w:b/>
+        </w:rPr>
+        <w:t>&gt;</w:t>
+      </w:r>
+      <w:r>
+        <w:t>Element</w:t>
+      </w:r>
+    </w:p>
+    <w:p>
+      <w:pPr>
+        <w:jc w:val="both"/>
+      </w:pPr>
+      <w:r>
+        <w:drawing>
+          <wp:anchor distT="0" distB="0" distL="114300" distR="114300" simplePos="0" relativeHeight="251661312" behindDoc="1" locked="0" layoutInCell="1" allowOverlap="1" wp14:anchorId="5D00FB59" wp14:editId="3A4E5DB7">
+            <wp:simplePos x="0" y="0"/>
+            <wp:positionH relativeFrom="column">
+              <wp:posOffset>26035</wp:posOffset>
+            </wp:positionH>
+            <wp:positionV relativeFrom="paragraph">
+              <wp:posOffset>3004820</wp:posOffset>
+            </wp:positionV>
+            <wp:extent cx="4935855" cy="1292860"/>
+            <wp:effectExtent l="0" t="0" r="0" b="2540"/>
+            <wp:wrapTight wrapText="bothSides">
+              <wp:wrapPolygon edited="0">
+                <wp:start x="0" y="0"/>
+                <wp:lineTo x="0" y="21324"/>
+                <wp:lineTo x="21508" y="21324"/>
+                <wp:lineTo x="21508" y="0"/>
+                <wp:lineTo x="0" y="0"/>
+              </wp:wrapPolygon>
+            </wp:wrapTight>
+            <wp:docPr id="1201762758" name="Grafik 1"/>
+            <wp:cNvGraphicFramePr>
+              <a:graphicFrameLocks xmlns:a="http://schemas.openxmlformats.org/drawingml/2006/main" noChangeAspect="1"/>
+            </wp:cNvGraphicFramePr>
+            <a:graphic xmlns:a="http://schemas.openxmlformats.org/drawingml/2006/main">
+              <a:graphicData uri="http://schemas.openxmlformats.org/drawingml/2006/picture">
+                <pic:pic xmlns:pic="http://schemas.openxmlformats.org/drawingml/2006/picture">
+                  <pic:nvPicPr>
+                    <pic:cNvPr id="1201762758" name=""/>
+                    <pic:cNvPicPr/>
+                  </pic:nvPicPr>
+                  <pic:blipFill>
+                    <a:blip r:embed="rId7">
+                      <a:extLst>
+                        <a:ext uri="{28A0092B-C50C-407E-A947-70E740481C1C}">
+                          <a14:useLocalDpi xmlns:a14="http://schemas.microsoft.com/office/drawing/2010/main" val="0"/>
+                        </a:ext>
+                      </a:extLst>
+                    </a:blip>
+                    <a:stretch>
+                      <a:fillRect/>
+                    </a:stretch>
+                  </pic:blipFill>
+                  <pic:spPr>
+                    <a:xfrm>
+                      <a:off x="0" y="0"/>
+                      <a:ext cx="4935855" cy="1292860"/>
+                    </a:xfrm>
+                    <a:prstGeom prst="rect">
+                      <a:avLst/>
+                    </a:prstGeom>
+                  </pic:spPr>
+                </pic:pic>
+              </a:graphicData>
+            </a:graphic>
+            <wp14:sizeRelH relativeFrom="margin">
+              <wp14:pctWidth>0</wp14:pctWidth>
+            </wp14:sizeRelH>
+            <wp14:sizeRelV relativeFrom="margin">
+              <wp14:pctHeight>0</wp14:pctHeight>
+            </wp14:sizeRelV>
+          </wp:anchor>
+        </w:drawing>
+      </w:r>
+      <w:r>
+        <w:drawing>
+          <wp:anchor distT="0" distB="0" distL="114300" distR="114300" simplePos="0" relativeHeight="251660288" behindDoc="1" locked="0" layoutInCell="1" allowOverlap="1" wp14:anchorId="55E2EE2A" wp14:editId="399E20E3">
+            <wp:simplePos x="0" y="0"/>
+            <wp:positionH relativeFrom="column">
+              <wp:posOffset>-2757</wp:posOffset>
+            </wp:positionH>
+            <wp:positionV relativeFrom="paragraph">
+              <wp:posOffset>-2837</wp:posOffset>
+            </wp:positionV>
+            <wp:extent cx="5760720" cy="2981960"/>
+            <wp:effectExtent l="0" t="0" r="0" b="8890"/>
+            <wp:wrapTight wrapText="bothSides">
+              <wp:wrapPolygon edited="0">
+                <wp:start x="0" y="0"/>
+                <wp:lineTo x="0" y="21526"/>
+                <wp:lineTo x="21500" y="21526"/>
+                <wp:lineTo x="21500" y="0"/>
+                <wp:lineTo x="0" y="0"/>
+              </wp:wrapPolygon>
+            </wp:wrapTight>
+            <wp:docPr id="1885340179" name="Grafik 1"/>
+            <wp:cNvGraphicFramePr>
+              <a:graphicFrameLocks xmlns:a="http://schemas.openxmlformats.org/drawingml/2006/main" noChangeAspect="1"/>
+            </wp:cNvGraphicFramePr>
+            <a:graphic xmlns:a="http://schemas.openxmlformats.org/drawingml/2006/main">
+              <a:graphicData uri="http://schemas.openxmlformats.org/drawingml/2006/picture">
+                <pic:pic xmlns:pic="http://schemas.openxmlformats.org/drawingml/2006/picture">
+                  <pic:nvPicPr>
+                    <pic:cNvPr id="1885340179" name=""/>
+                    <pic:cNvPicPr/>
+                  </pic:nvPicPr>
+                  <pic:blipFill>
+                    <a:blip r:embed="rId8" cstate="print">
+                      <a:extLst>
+                        <a:ext uri="{28A0092B-C50C-407E-A947-70E740481C1C}">
+                          <a14:useLocalDpi xmlns:a14="http://schemas.microsoft.com/office/drawing/2010/main" val="0"/>
+                        </a:ext>
+                      </a:extLst>
+                    </a:blip>
+                    <a:stretch>
+                      <a:fillRect/>
+                    </a:stretch>
+                  </pic:blipFill>
+                  <pic:spPr>
+                    <a:xfrm>
+                      <a:off x="0" y="0"/>
+                      <a:ext cx="5760720" cy="2981960"/>
+                    </a:xfrm>
+                    <a:prstGeom prst="rect">
+                      <a:avLst/>
+                    </a:prstGeom>
+                  </pic:spPr>
+                </pic:pic>
+              </a:graphicData>
+            </a:graphic>
+          </wp:anchor>
+        </w:drawing>
+      </w:r>
+    </w:p>
+    <w:p>
+      <w:pPr>
+        <w:jc w:val="both"/>
+      </w:pPr>
+    </w:p>
+    <w:p>
+      <w:pPr>
+        <w:jc w:val="both"/>
+      </w:pPr>
+    </w:p>
+    <w:p>
+      <w:pPr>
+        <w:jc w:val="both"/>
+      </w:pPr>
+    </w:p>
+    <w:p>
+      <w:pPr>
+        <w:numPr>
+          <w:ilvl w:val="0"/>
+          <w:numId w:val="3"/>
+        </w:numPr>
+        <w:jc w:val="both"/>
+      </w:pPr>
+      <w:r>
+        <w:lastRenderedPageBreak/>
+        <w:t>GET: Mit dieser Methode werden Daten von einer Ressource gefordert. Daten vom Browser können </w:t>
+      </w:r>
+      <w:r>
+        <w:rPr>
+          <w:b/>
+          <w:bCs/>
+        </w:rPr>
+        <w:t>nur</w:t>
+      </w:r>
+      <w:r>
+        <w:t> in der URL übermittelt werden, der Request-Body ist leer.</w:t>
+      </w:r>
+    </w:p>
+    <w:p>
+      <w:pPr>
+        <w:numPr>
+          <w:ilvl w:val="0"/>
+          <w:numId w:val="3"/>
+        </w:numPr>
+        <w:jc w:val="both"/>
+      </w:pPr>
+      <w:r>
+        <w:t xml:space="preserve">POST: Damit sendet der Browser Daten im Request-Body an einen Server, um eine Ressource zu erstellen oder zu ändern. POST ist sicherer als GET, weil die Parameter nicht in der Browser </w:t>
+      </w:r>
+      <w:proofErr w:type="spellStart"/>
+      <w:r>
+        <w:t>History</w:t>
+      </w:r>
+      <w:proofErr w:type="spellEnd"/>
+      <w:r>
+        <w:t xml:space="preserve"> oder in Web Server Logs gespeichert werden und die gesendeten Daten nicht sichtbar sind.</w:t>
+      </w:r>
+    </w:p>
+    <w:p>
+      <w:pPr>
+        <w:numPr>
+          <w:ilvl w:val="0"/>
+          <w:numId w:val="3"/>
+        </w:numPr>
+        <w:jc w:val="both"/>
+      </w:pPr>
+      <w:r>
+        <w:t>PUT: Wird verwendet, um ein Objekt zu erstellen oder zu aktualisieren. Auch hier wird der Request-Body für die Datenübertragung verwendet. Der Unterschied zu POST: Wenn PUT mehrmals aufgerufen wird (mit dem gleichen Inhalt und Parameter), wird nur ein Objekt erstellt und allenfalls aktualisiert. Im Gegensatz dazu hat das wiederholte Aufrufen einer POST-Anforderung den Nebeneffekt, dass dieselbe Ressource mehrfach erstellt wird.</w:t>
+      </w:r>
+    </w:p>
+    <w:p>
+      <w:pPr>
+        <w:numPr>
+          <w:ilvl w:val="0"/>
+          <w:numId w:val="3"/>
+        </w:numPr>
+        <w:jc w:val="both"/>
+      </w:pPr>
+      <w:r>
+        <w:t>DELETE: Wird verwendet, wenn sie ein Objekt gelöscht werden soll. Der Request-Body ist leer, der Response-Body kann einen Inhalt haben.</w:t>
+      </w:r>
+    </w:p>
+    <w:p>
+      <w:pPr>
+        <w:numPr>
+          <w:ilvl w:val="0"/>
+          <w:numId w:val="3"/>
+        </w:numPr>
+        <w:jc w:val="both"/>
+      </w:pPr>
+      <w:r>
+        <w:t>OPTIONS: Wird verwendet, wenn sie herausfinden möchten, welche Methoden diese URL unterstützt. Der Request- und auch der Response-Body sind leer.</w:t>
+      </w:r>
+    </w:p>
+    <w:p>
+      <w:pPr>
+        <w:numPr>
+          <w:ilvl w:val="0"/>
+          <w:numId w:val="3"/>
+        </w:numPr>
+        <w:jc w:val="both"/>
+      </w:pPr>
+      <w:r>
+        <w:t>HEAD: Wird verwendet, wenn sie nur die Header Informationen möchten. Der Request- und auch der Response-Body sind leer.</w:t>
+      </w:r>
+    </w:p>
+    <w:p>
+      <w:pPr>
+        <w:numPr>
+          <w:ilvl w:val="0"/>
+          <w:numId w:val="3"/>
+        </w:numPr>
+        <w:jc w:val="both"/>
+      </w:pPr>
+      <w:r>
+        <w:rPr>
+          <w:noProof/>
+        </w:rPr>
+        <w:drawing>
+          <wp:anchor distT="0" distB="0" distL="114300" distR="114300" simplePos="0" relativeHeight="251662336" behindDoc="1" locked="0" layoutInCell="1" allowOverlap="1" wp14:anchorId="7C6B0BEE" wp14:editId="748691AA">
+            <wp:simplePos x="0" y="0"/>
+            <wp:positionH relativeFrom="column">
+              <wp:posOffset>-535723</wp:posOffset>
+            </wp:positionH>
+            <wp:positionV relativeFrom="paragraph">
+              <wp:posOffset>324067</wp:posOffset>
+            </wp:positionV>
+            <wp:extent cx="3277870" cy="1845945"/>
+            <wp:effectExtent l="0" t="0" r="0" b="1905"/>
+            <wp:wrapTight wrapText="bothSides">
+              <wp:wrapPolygon edited="0">
+                <wp:start x="0" y="0"/>
+                <wp:lineTo x="0" y="21399"/>
+                <wp:lineTo x="21466" y="21399"/>
+                <wp:lineTo x="21466" y="0"/>
+                <wp:lineTo x="0" y="0"/>
+              </wp:wrapPolygon>
+            </wp:wrapTight>
+            <wp:docPr id="1867414834" name="Grafik 2"/>
+            <wp:cNvGraphicFramePr>
+              <a:graphicFrameLocks xmlns:a="http://schemas.openxmlformats.org/drawingml/2006/main" noChangeAspect="1"/>
+            </wp:cNvGraphicFramePr>
+            <a:graphic xmlns:a="http://schemas.openxmlformats.org/drawingml/2006/main">
+              <a:graphicData uri="http://schemas.openxmlformats.org/drawingml/2006/picture">
+                <pic:pic xmlns:pic="http://schemas.openxmlformats.org/drawingml/2006/picture">
+                  <pic:nvPicPr>
+                    <pic:cNvPr id="0" name="Picture 3"/>
+                    <pic:cNvPicPr>
+                      <a:picLocks noChangeAspect="1" noChangeArrowheads="1"/>
+                    </pic:cNvPicPr>
+                  </pic:nvPicPr>
+                  <pic:blipFill>
+                    <a:blip r:embed="rId9">
+                      <a:extLst>
+                        <a:ext uri="{28A0092B-C50C-407E-A947-70E740481C1C}">
+                          <a14:useLocalDpi xmlns:a14="http://schemas.microsoft.com/office/drawing/2010/main" val="0"/>
+                        </a:ext>
+                      </a:extLst>
+                    </a:blip>
+                    <a:srcRect/>
+                    <a:stretch>
+                      <a:fillRect/>
+                    </a:stretch>
+                  </pic:blipFill>
+                  <pic:spPr bwMode="auto">
+                    <a:xfrm>
+                      <a:off x="0" y="0"/>
+                      <a:ext cx="3277870" cy="1845945"/>
+                    </a:xfrm>
+                    <a:prstGeom prst="rect">
+                      <a:avLst/>
+                    </a:prstGeom>
+                    <a:noFill/>
+                    <a:ln>
+                      <a:noFill/>
+                    </a:ln>
+                  </pic:spPr>
+                </pic:pic>
+              </a:graphicData>
+            </a:graphic>
+            <wp14:sizeRelH relativeFrom="margin">
+              <wp14:pctWidth>0</wp14:pctWidth>
+            </wp14:sizeRelH>
+            <wp14:sizeRelV relativeFrom="margin">
+              <wp14:pctHeight>0</wp14:pctHeight>
+            </wp14:sizeRelV>
+          </wp:anchor>
+        </w:drawing>
+      </w:r>
+      <w:r>
+        <w:rPr>
+          <w:noProof/>
+        </w:rPr>
+        <w:drawing>
+          <wp:anchor distT="0" distB="0" distL="114300" distR="114300" simplePos="0" relativeHeight="251663360" behindDoc="1" locked="0" layoutInCell="1" allowOverlap="1" wp14:anchorId="49C02FF9" wp14:editId="73E3A9D4">
+            <wp:simplePos x="0" y="0"/>
+            <wp:positionH relativeFrom="column">
+              <wp:posOffset>2659380</wp:posOffset>
+            </wp:positionH>
+            <wp:positionV relativeFrom="paragraph">
+              <wp:posOffset>318135</wp:posOffset>
+            </wp:positionV>
+            <wp:extent cx="3681730" cy="1868805"/>
+            <wp:effectExtent l="0" t="0" r="0" b="0"/>
+            <wp:wrapTight wrapText="bothSides">
+              <wp:wrapPolygon edited="0">
+                <wp:start x="0" y="0"/>
+                <wp:lineTo x="0" y="21358"/>
+                <wp:lineTo x="21458" y="21358"/>
+                <wp:lineTo x="21458" y="0"/>
+                <wp:lineTo x="0" y="0"/>
+              </wp:wrapPolygon>
+            </wp:wrapTight>
+            <wp:docPr id="1849364269" name="Grafik 3"/>
+            <wp:cNvGraphicFramePr>
+              <a:graphicFrameLocks xmlns:a="http://schemas.openxmlformats.org/drawingml/2006/main" noChangeAspect="1"/>
+            </wp:cNvGraphicFramePr>
+            <a:graphic xmlns:a="http://schemas.openxmlformats.org/drawingml/2006/main">
+              <a:graphicData uri="http://schemas.openxmlformats.org/drawingml/2006/picture">
+                <pic:pic xmlns:pic="http://schemas.openxmlformats.org/drawingml/2006/picture">
+                  <pic:nvPicPr>
+                    <pic:cNvPr id="0" name="Picture 5"/>
+                    <pic:cNvPicPr>
+                      <a:picLocks noChangeAspect="1" noChangeArrowheads="1"/>
+                    </pic:cNvPicPr>
+                  </pic:nvPicPr>
+                  <pic:blipFill>
+                    <a:blip r:embed="rId10">
+                      <a:extLst>
+                        <a:ext uri="{28A0092B-C50C-407E-A947-70E740481C1C}">
+                          <a14:useLocalDpi xmlns:a14="http://schemas.microsoft.com/office/drawing/2010/main" val="0"/>
+                        </a:ext>
+                      </a:extLst>
+                    </a:blip>
+                    <a:srcRect/>
+                    <a:stretch>
+                      <a:fillRect/>
+                    </a:stretch>
+                  </pic:blipFill>
+                  <pic:spPr bwMode="auto">
+                    <a:xfrm>
+                      <a:off x="0" y="0"/>
+                      <a:ext cx="3681730" cy="1868805"/>
+                    </a:xfrm>
+                    <a:prstGeom prst="rect">
+                      <a:avLst/>
+                    </a:prstGeom>
+                    <a:noFill/>
+                    <a:ln>
+                      <a:noFill/>
+                    </a:ln>
+                  </pic:spPr>
+                </pic:pic>
+              </a:graphicData>
+            </a:graphic>
+            <wp14:sizeRelH relativeFrom="margin">
+              <wp14:pctWidth>0</wp14:pctWidth>
+            </wp14:sizeRelH>
+            <wp14:sizeRelV relativeFrom="margin">
+              <wp14:pctHeight>0</wp14:pctHeight>
+            </wp14:sizeRelV>
+          </wp:anchor>
+        </w:drawing>
+      </w:r>
+      <w:r>
+        <w:t>Weitere: CONNECT, TRACE, PATCH</w:t>
+      </w:r>
+    </w:p>
+    <w:p>
+      <w:pPr>
+        <w:jc w:val="both"/>
+      </w:pPr>
+    </w:p>
     <w:sectPr>
       <w:pgSz w:w="11906" w:h="16838"/>
       <w:pgMar w:top="1417" w:right="1417" w:bottom="1134" w:left="1417" w:header="708" w:footer="708" w:gutter="0"/>
@@ -11,6 +1398,467 @@
     </w:sectPr>
   </w:body>
 </w:document>
+</file>
+
+<file path=word/numbering.xml><?xml version="1.0" encoding="utf-8"?>
+<w:numbering xmlns:wpc="http://schemas.microsoft.com/office/word/2010/wordprocessingCanvas" xmlns:cx="http://schemas.microsoft.com/office/drawing/2014/chartex" xmlns:cx1="http://schemas.microsoft.com/office/drawing/2015/9/8/chartex" xmlns:cx2="http://schemas.microsoft.com/office/drawing/2015/10/21/chartex" xmlns:cx3="http://schemas.microsoft.com/office/drawing/2016/5/9/chartex" xmlns:cx4="http://schemas.microsoft.com/office/drawing/2016/5/10/chartex" xmlns:cx5="http://schemas.microsoft.com/office/drawing/2016/5/11/chartex" xmlns:cx6="http://schemas.microsoft.com/office/drawing/2016/5/12/chartex" xmlns:cx7="http://schemas.microsoft.com/office/drawing/2016/5/13/chartex" xmlns:cx8="http://schemas.microsoft.com/office/drawing/2016/5/14/chartex" xmlns:mc="http://schemas.openxmlformats.org/markup-compatibility/2006" xmlns:aink="http://schemas.microsoft.com/office/drawing/2016/ink" xmlns:am3d="http://schemas.microsoft.com/office/drawing/2017/model3d" xmlns:o="urn:schemas-microsoft-com:office:office" xmlns:oel="http://schemas.microsoft.com/office/2019/extlst" xmlns:r="http://schemas.openxmlformats.org/officeDocument/2006/relationships" xmlns:m="http://schemas.openxmlformats.org/officeDocument/2006/math" xmlns:v="urn:schemas-microsoft-com:vml" xmlns:wp14="http://schemas.microsoft.com/office/word/2010/wordprocessingDrawing" xmlns:wp="http://schemas.openxmlformats.org/drawingml/2006/wordprocessingDrawing" xmlns:w10="urn:schemas-microsoft-com:office:word" xmlns:w="http://schemas.openxmlformats.org/wordprocessingml/2006/main" xmlns:w14="http://schemas.microsoft.com/office/word/2010/wordml" xmlns:w15="http://schemas.microsoft.com/office/word/2012/wordml" xmlns:w16cex="http://schemas.microsoft.com/office/word/2018/wordml/cex" xmlns:w16cid="http://schemas.microsoft.com/office/word/2016/wordml/cid" xmlns:w16="http://schemas.microsoft.com/office/word/2018/wordml" xmlns:w16du="http://schemas.microsoft.com/office/word/2023/wordml/word16du" xmlns:w16sdtdh="http://schemas.microsoft.com/office/word/2020/wordml/sdtdatahash" xmlns:w16sdtfl="http://schemas.microsoft.com/office/word/2024/wordml/sdtformatlock" xmlns:w16se="http://schemas.microsoft.com/office/word/2015/wordml/symex" xmlns:wpg="http://schemas.microsoft.com/office/word/2010/wordprocessingGroup" xmlns:wpi="http://schemas.microsoft.com/office/word/2010/wordprocessingInk" xmlns:wne="http://schemas.microsoft.com/office/word/2006/wordml" xmlns:wps="http://schemas.microsoft.com/office/word/2010/wordprocessingShape" mc:Ignorable="w14 w15 w16se w16cid w16 w16cex w16sdtdh w16sdtfl w16du wp14">
+  <w:abstractNum w:abstractNumId="0" w15:restartNumberingAfterBreak="0">
+    <w:nsid w:val="16A44EBE"/>
+    <w:multiLevelType w:val="multilevel"/>
+    <w:tmpl w:val="16308316"/>
+    <w:lvl w:ilvl="0">
+      <w:start w:val="1"/>
+      <w:numFmt w:val="bullet"/>
+      <w:lvlText w:val=""/>
+      <w:lvlJc w:val="left"/>
+      <w:pPr>
+        <w:tabs>
+          <w:tab w:val="num" w:pos="720"/>
+        </w:tabs>
+        <w:ind w:left="720" w:hanging="360"/>
+      </w:pPr>
+      <w:rPr>
+        <w:rFonts w:ascii="Symbol" w:hAnsi="Symbol" w:hint="default"/>
+        <w:sz w:val="20"/>
+      </w:rPr>
+    </w:lvl>
+    <w:lvl w:ilvl="1" w:tentative="1">
+      <w:start w:val="1"/>
+      <w:numFmt w:val="bullet"/>
+      <w:lvlText w:val=""/>
+      <w:lvlJc w:val="left"/>
+      <w:pPr>
+        <w:tabs>
+          <w:tab w:val="num" w:pos="1440"/>
+        </w:tabs>
+        <w:ind w:left="1440" w:hanging="360"/>
+      </w:pPr>
+      <w:rPr>
+        <w:rFonts w:ascii="Symbol" w:hAnsi="Symbol" w:hint="default"/>
+        <w:sz w:val="20"/>
+      </w:rPr>
+    </w:lvl>
+    <w:lvl w:ilvl="2" w:tentative="1">
+      <w:start w:val="1"/>
+      <w:numFmt w:val="bullet"/>
+      <w:lvlText w:val=""/>
+      <w:lvlJc w:val="left"/>
+      <w:pPr>
+        <w:tabs>
+          <w:tab w:val="num" w:pos="2160"/>
+        </w:tabs>
+        <w:ind w:left="2160" w:hanging="360"/>
+      </w:pPr>
+      <w:rPr>
+        <w:rFonts w:ascii="Symbol" w:hAnsi="Symbol" w:hint="default"/>
+        <w:sz w:val="20"/>
+      </w:rPr>
+    </w:lvl>
+    <w:lvl w:ilvl="3" w:tentative="1">
+      <w:start w:val="1"/>
+      <w:numFmt w:val="bullet"/>
+      <w:lvlText w:val=""/>
+      <w:lvlJc w:val="left"/>
+      <w:pPr>
+        <w:tabs>
+          <w:tab w:val="num" w:pos="2880"/>
+        </w:tabs>
+        <w:ind w:left="2880" w:hanging="360"/>
+      </w:pPr>
+      <w:rPr>
+        <w:rFonts w:ascii="Symbol" w:hAnsi="Symbol" w:hint="default"/>
+        <w:sz w:val="20"/>
+      </w:rPr>
+    </w:lvl>
+    <w:lvl w:ilvl="4" w:tentative="1">
+      <w:start w:val="1"/>
+      <w:numFmt w:val="bullet"/>
+      <w:lvlText w:val=""/>
+      <w:lvlJc w:val="left"/>
+      <w:pPr>
+        <w:tabs>
+          <w:tab w:val="num" w:pos="3600"/>
+        </w:tabs>
+        <w:ind w:left="3600" w:hanging="360"/>
+      </w:pPr>
+      <w:rPr>
+        <w:rFonts w:ascii="Symbol" w:hAnsi="Symbol" w:hint="default"/>
+        <w:sz w:val="20"/>
+      </w:rPr>
+    </w:lvl>
+    <w:lvl w:ilvl="5" w:tentative="1">
+      <w:start w:val="1"/>
+      <w:numFmt w:val="bullet"/>
+      <w:lvlText w:val=""/>
+      <w:lvlJc w:val="left"/>
+      <w:pPr>
+        <w:tabs>
+          <w:tab w:val="num" w:pos="4320"/>
+        </w:tabs>
+        <w:ind w:left="4320" w:hanging="360"/>
+      </w:pPr>
+      <w:rPr>
+        <w:rFonts w:ascii="Symbol" w:hAnsi="Symbol" w:hint="default"/>
+        <w:sz w:val="20"/>
+      </w:rPr>
+    </w:lvl>
+    <w:lvl w:ilvl="6" w:tentative="1">
+      <w:start w:val="1"/>
+      <w:numFmt w:val="bullet"/>
+      <w:lvlText w:val=""/>
+      <w:lvlJc w:val="left"/>
+      <w:pPr>
+        <w:tabs>
+          <w:tab w:val="num" w:pos="5040"/>
+        </w:tabs>
+        <w:ind w:left="5040" w:hanging="360"/>
+      </w:pPr>
+      <w:rPr>
+        <w:rFonts w:ascii="Symbol" w:hAnsi="Symbol" w:hint="default"/>
+        <w:sz w:val="20"/>
+      </w:rPr>
+    </w:lvl>
+    <w:lvl w:ilvl="7" w:tentative="1">
+      <w:start w:val="1"/>
+      <w:numFmt w:val="bullet"/>
+      <w:lvlText w:val=""/>
+      <w:lvlJc w:val="left"/>
+      <w:pPr>
+        <w:tabs>
+          <w:tab w:val="num" w:pos="5760"/>
+        </w:tabs>
+        <w:ind w:left="5760" w:hanging="360"/>
+      </w:pPr>
+      <w:rPr>
+        <w:rFonts w:ascii="Symbol" w:hAnsi="Symbol" w:hint="default"/>
+        <w:sz w:val="20"/>
+      </w:rPr>
+    </w:lvl>
+    <w:lvl w:ilvl="8" w:tentative="1">
+      <w:start w:val="1"/>
+      <w:numFmt w:val="bullet"/>
+      <w:lvlText w:val=""/>
+      <w:lvlJc w:val="left"/>
+      <w:pPr>
+        <w:tabs>
+          <w:tab w:val="num" w:pos="6480"/>
+        </w:tabs>
+        <w:ind w:left="6480" w:hanging="360"/>
+      </w:pPr>
+      <w:rPr>
+        <w:rFonts w:ascii="Symbol" w:hAnsi="Symbol" w:hint="default"/>
+        <w:sz w:val="20"/>
+      </w:rPr>
+    </w:lvl>
+  </w:abstractNum>
+  <w:abstractNum w:abstractNumId="1" w15:restartNumberingAfterBreak="0">
+    <w:nsid w:val="25AB4E0A"/>
+    <w:multiLevelType w:val="multilevel"/>
+    <w:tmpl w:val="501CC464"/>
+    <w:lvl w:ilvl="0">
+      <w:start w:val="1"/>
+      <w:numFmt w:val="bullet"/>
+      <w:lvlText w:val=""/>
+      <w:lvlJc w:val="left"/>
+      <w:pPr>
+        <w:tabs>
+          <w:tab w:val="num" w:pos="720"/>
+        </w:tabs>
+        <w:ind w:left="720" w:hanging="360"/>
+      </w:pPr>
+      <w:rPr>
+        <w:rFonts w:ascii="Symbol" w:hAnsi="Symbol" w:hint="default"/>
+        <w:sz w:val="20"/>
+      </w:rPr>
+    </w:lvl>
+    <w:lvl w:ilvl="1" w:tentative="1">
+      <w:start w:val="1"/>
+      <w:numFmt w:val="bullet"/>
+      <w:lvlText w:val=""/>
+      <w:lvlJc w:val="left"/>
+      <w:pPr>
+        <w:tabs>
+          <w:tab w:val="num" w:pos="1440"/>
+        </w:tabs>
+        <w:ind w:left="1440" w:hanging="360"/>
+      </w:pPr>
+      <w:rPr>
+        <w:rFonts w:ascii="Symbol" w:hAnsi="Symbol" w:hint="default"/>
+        <w:sz w:val="20"/>
+      </w:rPr>
+    </w:lvl>
+    <w:lvl w:ilvl="2" w:tentative="1">
+      <w:start w:val="1"/>
+      <w:numFmt w:val="bullet"/>
+      <w:lvlText w:val=""/>
+      <w:lvlJc w:val="left"/>
+      <w:pPr>
+        <w:tabs>
+          <w:tab w:val="num" w:pos="2160"/>
+        </w:tabs>
+        <w:ind w:left="2160" w:hanging="360"/>
+      </w:pPr>
+      <w:rPr>
+        <w:rFonts w:ascii="Symbol" w:hAnsi="Symbol" w:hint="default"/>
+        <w:sz w:val="20"/>
+      </w:rPr>
+    </w:lvl>
+    <w:lvl w:ilvl="3" w:tentative="1">
+      <w:start w:val="1"/>
+      <w:numFmt w:val="bullet"/>
+      <w:lvlText w:val=""/>
+      <w:lvlJc w:val="left"/>
+      <w:pPr>
+        <w:tabs>
+          <w:tab w:val="num" w:pos="2880"/>
+        </w:tabs>
+        <w:ind w:left="2880" w:hanging="360"/>
+      </w:pPr>
+      <w:rPr>
+        <w:rFonts w:ascii="Symbol" w:hAnsi="Symbol" w:hint="default"/>
+        <w:sz w:val="20"/>
+      </w:rPr>
+    </w:lvl>
+    <w:lvl w:ilvl="4" w:tentative="1">
+      <w:start w:val="1"/>
+      <w:numFmt w:val="bullet"/>
+      <w:lvlText w:val=""/>
+      <w:lvlJc w:val="left"/>
+      <w:pPr>
+        <w:tabs>
+          <w:tab w:val="num" w:pos="3600"/>
+        </w:tabs>
+        <w:ind w:left="3600" w:hanging="360"/>
+      </w:pPr>
+      <w:rPr>
+        <w:rFonts w:ascii="Symbol" w:hAnsi="Symbol" w:hint="default"/>
+        <w:sz w:val="20"/>
+      </w:rPr>
+    </w:lvl>
+    <w:lvl w:ilvl="5" w:tentative="1">
+      <w:start w:val="1"/>
+      <w:numFmt w:val="bullet"/>
+      <w:lvlText w:val=""/>
+      <w:lvlJc w:val="left"/>
+      <w:pPr>
+        <w:tabs>
+          <w:tab w:val="num" w:pos="4320"/>
+        </w:tabs>
+        <w:ind w:left="4320" w:hanging="360"/>
+      </w:pPr>
+      <w:rPr>
+        <w:rFonts w:ascii="Symbol" w:hAnsi="Symbol" w:hint="default"/>
+        <w:sz w:val="20"/>
+      </w:rPr>
+    </w:lvl>
+    <w:lvl w:ilvl="6" w:tentative="1">
+      <w:start w:val="1"/>
+      <w:numFmt w:val="bullet"/>
+      <w:lvlText w:val=""/>
+      <w:lvlJc w:val="left"/>
+      <w:pPr>
+        <w:tabs>
+          <w:tab w:val="num" w:pos="5040"/>
+        </w:tabs>
+        <w:ind w:left="5040" w:hanging="360"/>
+      </w:pPr>
+      <w:rPr>
+        <w:rFonts w:ascii="Symbol" w:hAnsi="Symbol" w:hint="default"/>
+        <w:sz w:val="20"/>
+      </w:rPr>
+    </w:lvl>
+    <w:lvl w:ilvl="7" w:tentative="1">
+      <w:start w:val="1"/>
+      <w:numFmt w:val="bullet"/>
+      <w:lvlText w:val=""/>
+      <w:lvlJc w:val="left"/>
+      <w:pPr>
+        <w:tabs>
+          <w:tab w:val="num" w:pos="5760"/>
+        </w:tabs>
+        <w:ind w:left="5760" w:hanging="360"/>
+      </w:pPr>
+      <w:rPr>
+        <w:rFonts w:ascii="Symbol" w:hAnsi="Symbol" w:hint="default"/>
+        <w:sz w:val="20"/>
+      </w:rPr>
+    </w:lvl>
+    <w:lvl w:ilvl="8" w:tentative="1">
+      <w:start w:val="1"/>
+      <w:numFmt w:val="bullet"/>
+      <w:lvlText w:val=""/>
+      <w:lvlJc w:val="left"/>
+      <w:pPr>
+        <w:tabs>
+          <w:tab w:val="num" w:pos="6480"/>
+        </w:tabs>
+        <w:ind w:left="6480" w:hanging="360"/>
+      </w:pPr>
+      <w:rPr>
+        <w:rFonts w:ascii="Symbol" w:hAnsi="Symbol" w:hint="default"/>
+        <w:sz w:val="20"/>
+      </w:rPr>
+    </w:lvl>
+  </w:abstractNum>
+  <w:abstractNum w:abstractNumId="2" w15:restartNumberingAfterBreak="0">
+    <w:nsid w:val="60166FE3"/>
+    <w:multiLevelType w:val="multilevel"/>
+    <w:tmpl w:val="4D36945E"/>
+    <w:lvl w:ilvl="0">
+      <w:start w:val="1"/>
+      <w:numFmt w:val="bullet"/>
+      <w:lvlText w:val=""/>
+      <w:lvlJc w:val="left"/>
+      <w:pPr>
+        <w:tabs>
+          <w:tab w:val="num" w:pos="720"/>
+        </w:tabs>
+        <w:ind w:left="720" w:hanging="360"/>
+      </w:pPr>
+      <w:rPr>
+        <w:rFonts w:ascii="Symbol" w:hAnsi="Symbol" w:hint="default"/>
+        <w:sz w:val="20"/>
+      </w:rPr>
+    </w:lvl>
+    <w:lvl w:ilvl="1" w:tentative="1">
+      <w:start w:val="1"/>
+      <w:numFmt w:val="bullet"/>
+      <w:lvlText w:val=""/>
+      <w:lvlJc w:val="left"/>
+      <w:pPr>
+        <w:tabs>
+          <w:tab w:val="num" w:pos="1440"/>
+        </w:tabs>
+        <w:ind w:left="1440" w:hanging="360"/>
+      </w:pPr>
+      <w:rPr>
+        <w:rFonts w:ascii="Symbol" w:hAnsi="Symbol" w:hint="default"/>
+        <w:sz w:val="20"/>
+      </w:rPr>
+    </w:lvl>
+    <w:lvl w:ilvl="2" w:tentative="1">
+      <w:start w:val="1"/>
+      <w:numFmt w:val="bullet"/>
+      <w:lvlText w:val=""/>
+      <w:lvlJc w:val="left"/>
+      <w:pPr>
+        <w:tabs>
+          <w:tab w:val="num" w:pos="2160"/>
+        </w:tabs>
+        <w:ind w:left="2160" w:hanging="360"/>
+      </w:pPr>
+      <w:rPr>
+        <w:rFonts w:ascii="Symbol" w:hAnsi="Symbol" w:hint="default"/>
+        <w:sz w:val="20"/>
+      </w:rPr>
+    </w:lvl>
+    <w:lvl w:ilvl="3" w:tentative="1">
+      <w:start w:val="1"/>
+      <w:numFmt w:val="bullet"/>
+      <w:lvlText w:val=""/>
+      <w:lvlJc w:val="left"/>
+      <w:pPr>
+        <w:tabs>
+          <w:tab w:val="num" w:pos="2880"/>
+        </w:tabs>
+        <w:ind w:left="2880" w:hanging="360"/>
+      </w:pPr>
+      <w:rPr>
+        <w:rFonts w:ascii="Symbol" w:hAnsi="Symbol" w:hint="default"/>
+        <w:sz w:val="20"/>
+      </w:rPr>
+    </w:lvl>
+    <w:lvl w:ilvl="4" w:tentative="1">
+      <w:start w:val="1"/>
+      <w:numFmt w:val="bullet"/>
+      <w:lvlText w:val=""/>
+      <w:lvlJc w:val="left"/>
+      <w:pPr>
+        <w:tabs>
+          <w:tab w:val="num" w:pos="3600"/>
+        </w:tabs>
+        <w:ind w:left="3600" w:hanging="360"/>
+      </w:pPr>
+      <w:rPr>
+        <w:rFonts w:ascii="Symbol" w:hAnsi="Symbol" w:hint="default"/>
+        <w:sz w:val="20"/>
+      </w:rPr>
+    </w:lvl>
+    <w:lvl w:ilvl="5" w:tentative="1">
+      <w:start w:val="1"/>
+      <w:numFmt w:val="bullet"/>
+      <w:lvlText w:val=""/>
+      <w:lvlJc w:val="left"/>
+      <w:pPr>
+        <w:tabs>
+          <w:tab w:val="num" w:pos="4320"/>
+        </w:tabs>
+        <w:ind w:left="4320" w:hanging="360"/>
+      </w:pPr>
+      <w:rPr>
+        <w:rFonts w:ascii="Symbol" w:hAnsi="Symbol" w:hint="default"/>
+        <w:sz w:val="20"/>
+      </w:rPr>
+    </w:lvl>
+    <w:lvl w:ilvl="6" w:tentative="1">
+      <w:start w:val="1"/>
+      <w:numFmt w:val="bullet"/>
+      <w:lvlText w:val=""/>
+      <w:lvlJc w:val="left"/>
+      <w:pPr>
+        <w:tabs>
+          <w:tab w:val="num" w:pos="5040"/>
+        </w:tabs>
+        <w:ind w:left="5040" w:hanging="360"/>
+      </w:pPr>
+      <w:rPr>
+        <w:rFonts w:ascii="Symbol" w:hAnsi="Symbol" w:hint="default"/>
+        <w:sz w:val="20"/>
+      </w:rPr>
+    </w:lvl>
+    <w:lvl w:ilvl="7" w:tentative="1">
+      <w:start w:val="1"/>
+      <w:numFmt w:val="bullet"/>
+      <w:lvlText w:val=""/>
+      <w:lvlJc w:val="left"/>
+      <w:pPr>
+        <w:tabs>
+          <w:tab w:val="num" w:pos="5760"/>
+        </w:tabs>
+        <w:ind w:left="5760" w:hanging="360"/>
+      </w:pPr>
+      <w:rPr>
+        <w:rFonts w:ascii="Symbol" w:hAnsi="Symbol" w:hint="default"/>
+        <w:sz w:val="20"/>
+      </w:rPr>
+    </w:lvl>
+    <w:lvl w:ilvl="8" w:tentative="1">
+      <w:start w:val="1"/>
+      <w:numFmt w:val="bullet"/>
+      <w:lvlText w:val=""/>
+      <w:lvlJc w:val="left"/>
+      <w:pPr>
+        <w:tabs>
+          <w:tab w:val="num" w:pos="6480"/>
+        </w:tabs>
+        <w:ind w:left="6480" w:hanging="360"/>
+      </w:pPr>
+      <w:rPr>
+        <w:rFonts w:ascii="Symbol" w:hAnsi="Symbol" w:hint="default"/>
+        <w:sz w:val="20"/>
+      </w:rPr>
+    </w:lvl>
+  </w:abstractNum>
+  <w:num w:numId="1" w16cid:durableId="602884130">
+    <w:abstractNumId w:val="0"/>
+  </w:num>
+  <w:num w:numId="2" w16cid:durableId="840043776">
+    <w:abstractNumId w:val="2"/>
+  </w:num>
+  <w:num w:numId="3" w16cid:durableId="1368869484">
+    <w:abstractNumId w:val="1"/>
+  </w:num>
+</w:numbering>
 </file>
 
 <file path=word/styles.xml><?xml version="1.0" encoding="utf-8"?>
@@ -616,7 +2464,6 @@
   <w:style w:type="character" w:default="1" w:styleId="Absatz-Standardschriftart">
     <w:name w:val="Default Paragraph Font"/>
     <w:uiPriority w:val="1"/>
-    <w:semiHidden/>
     <w:unhideWhenUsed/>
   </w:style>
   <w:style w:type="table" w:default="1" w:styleId="NormaleTabelle">

</xml_diff>